<commit_message>
Complete end-to-end manuscript audit
</commit_message>
<xml_diff>
--- a/paper/main.docx
+++ b/paper/main.docx
@@ -98,7 +98,11 @@
       </w:r>
     </w:p>
     <w:p>
-      <w:r/>
+      <w:r>
+        <w:pict>
+          <v:rect style="width:0;height:1.5pt" o:hralign="center" o:hrstd="t" o:hr="t"/>
+        </w:pict>
+      </w:r>
     </w:p>
     <w:bookmarkStart w:id="9" w:name="abstract"/>
     <w:p>
@@ -106,7 +110,7 @@
         <w:pStyle w:val="Heading1"/>
       </w:pPr>
       <w:r>
-        <w:t>Abstract</w:t>
+        <w:t xml:space="preserve">Abstract</w:t>
       </w:r>
     </w:p>
     <w:p>
@@ -118,13 +122,13 @@
           <w:b/>
           <w:bCs/>
         </w:rPr>
-        <w:t>Background.</w:t>
-      </w:r>
-      <w:r>
-        <w:t xml:space="preserve"> </w:t>
-      </w:r>
-      <w:r>
-        <w:t>The PAM50 Risk-of-Recurrence (ROR) score is the most widely used genomic prognostic signal in breast cancer. Recent reports suggest pathway-based machine learning may outperform PAM50-ROR, particularly in triple-negative breast cancer (TNBC), but those studies often compare against surrogate rather than official PAM50, are not pre-registered, and validate in a single cohort. We tested whether pathway-based survival machine learning exceeds official PAM50-ROR under stricter conditions.</w:t>
+        <w:t xml:space="preserve">Background.</w:t>
+      </w:r>
+      <w:r>
+        <w:t xml:space="preserve"> </w:t>
+      </w:r>
+      <w:r>
+        <w:t xml:space="preserve">The PAM50 Risk-of-Recurrence (ROR) score is the most widely used genomic prognostic signal in breast cancer. Recent reports suggest pathway-based machine learning may outperform PAM50-ROR, particularly in triple-negative breast cancer (TNBC), but those studies often compare against surrogate rather than official PAM50, are not pre-registered, and validate in a single cohort. We tested whether pathway-based survival machine learning exceeds official PAM50-ROR under stricter conditions.</w:t>
       </w:r>
     </w:p>
     <w:p>
@@ -136,13 +140,13 @@
           <w:b/>
           <w:bCs/>
         </w:rPr>
-        <w:t>Methods.</w:t>
-      </w:r>
-      <w:r>
-        <w:t xml:space="preserve"> </w:t>
-      </w:r>
-      <w:r>
-        <w:t>A pre-registered protocol locked the primary endpoint (random-effects meta-analyzed</w:t>
+        <w:t xml:space="preserve">Methods.</w:t>
+      </w:r>
+      <w:r>
+        <w:t xml:space="preserve"> </w:t>
+      </w:r>
+      <w:r>
+        <w:t xml:space="preserve">A pre-registered protocol locked the primary endpoint (random-effects meta-analyzed</w:t>
       </w:r>
       <w:r>
         <w:t xml:space="preserve"> </w:t>
@@ -156,7 +160,7 @@
         </m:r>
       </m:oMath>
       <w:r>
-        <w:t>C-index</w:t>
+        <w:t xml:space="preserve">C-index</w:t>
       </w:r>
       <w:r>
         <w:t xml:space="preserve"> </w:t>
@@ -182,7 +186,7 @@
         <w:t xml:space="preserve"> </w:t>
       </w:r>
       <w:r>
-        <w:t>at</w:t>
+        <w:t xml:space="preserve">at</w:t>
       </w:r>
       <w:r>
         <w:t xml:space="preserve"> </w:t>
@@ -205,7 +209,7 @@
         <w:t xml:space="preserve"> </w:t>
       </w:r>
       <w:r>
-        <w:t>in TNBC versus official genefu::rorS), the comparator, and the model-selection rule before any external cohort was scored. Seven pathway activity scores were combined with two clinical covariates available across cohorts (age and ordinal stage). Six survival models were trained on TCGA-BRCA (</w:t>
+        <w:t xml:space="preserve">in TNBC versus official genefu::rorS), the comparator, and the model-selection rule before any external cohort was scored. Seven pathway activity scores were combined with two clinical covariates available across cohorts (age and ordinal stage). Six survival models were trained on TCGA-BRCA (</w:t>
       </w:r>
       <m:oMath>
         <m:r>
@@ -222,7 +226,7 @@
         </m:r>
       </m:oMath>
       <w:r>
-        <w:t>) under five-fold cross-validation; the locked model was applied without refitting to GSE96058 / SCAN-B (</w:t>
+        <w:t xml:space="preserve">) under five-fold cross-validation; the locked model was applied without refitting to GSE96058 / SCAN-B (</w:t>
       </w:r>
       <m:oMath>
         <m:r>
@@ -248,7 +252,7 @@
         </m:r>
       </m:oMath>
       <w:r>
-        <w:t>), METABRIC (</w:t>
+        <w:t xml:space="preserve">), METABRIC (</w:t>
       </w:r>
       <m:oMath>
         <m:r>
@@ -277,7 +281,7 @@
         <w:t xml:space="preserve"> </w:t>
       </w:r>
       <w:r>
-        <w:t>evaluable), and GSE20685 (</w:t>
+        <w:t xml:space="preserve">evaluable), and GSE20685 (</w:t>
       </w:r>
       <m:oMath>
         <m:r>
@@ -294,7 +298,7 @@
         </m:r>
       </m:oMath>
       <w:r>
-        <w:t>). Harmonized</w:t>
+        <w:t xml:space="preserve">). Harmonized</w:t>
       </w:r>
       <w:r>
         <w:t xml:space="preserve"> </w:t>
@@ -323,7 +327,7 @@
         </m:r>
       </m:oMath>
       <w:r>
-        <w:t>. We computed Harrell’s C, calibration, decision curve analysis, NRI/IDI, and permutation-importance stability.</w:t>
+        <w:t xml:space="preserve">. We computed Harrell’s C, calibration, decision curve analysis, NRI/IDI, and permutation-importance stability.</w:t>
       </w:r>
     </w:p>
     <w:p>
@@ -335,13 +339,13 @@
           <w:b/>
           <w:bCs/>
         </w:rPr>
-        <w:t>Results.</w:t>
-      </w:r>
-      <w:r>
-        <w:t xml:space="preserve"> </w:t>
-      </w:r>
-      <w:r>
-        <w:t>The pre-registered TNBC primary endpoint was not met (meta</w:t>
+        <w:t xml:space="preserve">Results.</w:t>
+      </w:r>
+      <w:r>
+        <w:t xml:space="preserve"> </w:t>
+      </w:r>
+      <w:r>
+        <w:t xml:space="preserve">The pre-registered TNBC primary endpoint was not met (meta</w:t>
       </w:r>
       <w:r>
         <w:t xml:space="preserve"> </w:t>
@@ -355,7 +359,7 @@
         </m:r>
       </m:oMath>
       <w:r>
-        <w:t>C</w:t>
+        <w:t xml:space="preserve">C</w:t>
       </w:r>
       <w:r>
         <w:t xml:space="preserve"> </w:t>
@@ -378,7 +382,7 @@
         </m:r>
       </m:oMath>
       <w:r>
-        <w:t>, 95% CI</w:t>
+        <w:t xml:space="preserve">, 95% CI</w:t>
       </w:r>
       <w:r>
         <w:t xml:space="preserve"> </w:t>
@@ -398,7 +402,7 @@
         <w:t xml:space="preserve"> </w:t>
       </w:r>
       <w:r>
-        <w:t>to</w:t>
+        <w:t xml:space="preserve">to</w:t>
       </w:r>
       <w:r>
         <w:t xml:space="preserve"> </w:t>
@@ -415,7 +419,7 @@
         </m:r>
       </m:oMath>
       <w:r>
-        <w:t>,</w:t>
+        <w:t xml:space="preserve">,</w:t>
       </w:r>
       <w:r>
         <w:t xml:space="preserve"> </w:t>
@@ -435,7 +439,7 @@
         </m:r>
       </m:oMath>
       <w:r>
-        <w:t>,</w:t>
+        <w:t xml:space="preserve">,</w:t>
       </w:r>
       <w:r>
         <w:t xml:space="preserve"> </w:t>
@@ -470,7 +474,7 @@
         </m:r>
       </m:oMath>
       <w:r>
-        <w:t>). A sensitivity excluding TCGA gave</w:t>
+        <w:t xml:space="preserve">). A sensitivity excluding TCGA gave</w:t>
       </w:r>
       <w:r>
         <w:t xml:space="preserve"> </w:t>
@@ -484,7 +488,7 @@
         </m:r>
       </m:oMath>
       <w:r>
-        <w:t>C</w:t>
+        <w:t xml:space="preserve">C</w:t>
       </w:r>
       <w:r>
         <w:t xml:space="preserve"> </w:t>
@@ -510,7 +514,7 @@
         <w:t xml:space="preserve"> </w:t>
       </w:r>
       <w:r>
-        <w:t>(</w:t>
+        <w:t xml:space="preserve">(</w:t>
       </w:r>
       <m:oMath>
         <m:r>
@@ -527,7 +531,7 @@
         </m:r>
       </m:oMath>
       <w:r>
-        <w:t>). External discrimination was comparable (per-cohort C: locked model 0.555 to 0.673, PAM50-ROR 0.504 to 0.635). Feature ablation showed no combination exceeded PAM50-ROR on mean external C. Secondary signals favoured the locked model but were small: mean 5-year Integrated Calibration Index 0.125 versus 0.155, IDI</w:t>
+        <w:t xml:space="preserve">). External discrimination was comparable (per-cohort C: locked model 0.555 to 0.673, PAM50-ROR 0.504 to 0.635). Feature ablation showed no combination exceeded PAM50-ROR on mean external C. Secondary signals favoured the locked model but were small: mean 5-year Integrated Calibration Index 0.125 versus 0.155, IDI</w:t>
       </w:r>
       <w:r>
         <w:t xml:space="preserve"> </w:t>
@@ -547,7 +551,7 @@
         <w:t xml:space="preserve"> </w:t>
       </w:r>
       <w:r>
-        <w:t>to</w:t>
+        <w:t xml:space="preserve">to</w:t>
       </w:r>
       <w:r>
         <w:t xml:space="preserve"> </w:t>
@@ -564,7 +568,7 @@
         </m:r>
       </m:oMath>
       <w:r>
-        <w:t>, and mean</w:t>
+        <w:t xml:space="preserve">, and mean</w:t>
       </w:r>
       <w:r>
         <w:t xml:space="preserve"> </w:t>
@@ -578,7 +582,7 @@
         </m:r>
       </m:oMath>
       <w:r>
-        <w:t>NB</w:t>
+        <w:t xml:space="preserve">NB</w:t>
       </w:r>
       <w:r>
         <w:t xml:space="preserve"> </w:t>
@@ -595,7 +599,7 @@
         </m:r>
       </m:oMath>
       <w:r>
-        <w:t>. Three features were consistently top-ranked (Pathway-Hormone, age, Pathway-DNA-Repair). A transparent exploratory analysis across 391 model variants also failed to meet the threshold.</w:t>
+        <w:t xml:space="preserve">. Three features were consistently top-ranked (Pathway-Hormone, age, Pathway-DNA-Repair). A transparent exploratory analysis across 391 model variants also failed to meet the threshold.</w:t>
       </w:r>
     </w:p>
     <w:p>
@@ -607,13 +611,13 @@
           <w:b/>
           <w:bCs/>
         </w:rPr>
-        <w:t>Conclusions.</w:t>
-      </w:r>
-      <w:r>
-        <w:t xml:space="preserve"> </w:t>
-      </w:r>
-      <w:r>
-        <w:t>Under pre-registration with the official PAM50 comparator and across four independent cohorts, pathway-based machine learning was competitive with but did not exceed PAM50-ROR, including in TNBC. It may best be considered an auxiliary signal for combination with PAM50-ROR rather than a replacement.</w:t>
+        <w:t xml:space="preserve">Conclusions.</w:t>
+      </w:r>
+      <w:r>
+        <w:t xml:space="preserve"> </w:t>
+      </w:r>
+      <w:r>
+        <w:t xml:space="preserve">Under pre-registration with the official PAM50 comparator and across four independent cohorts, pathway-based machine learning was competitive with but did not exceed PAM50-ROR, including in TNBC. It may best be considered an auxiliary signal for combination with PAM50-ROR rather than a replacement.</w:t>
       </w:r>
     </w:p>
     <w:p>
@@ -625,17 +629,21 @@
           <w:b/>
           <w:bCs/>
         </w:rPr>
-        <w:t>Keywords:</w:t>
-      </w:r>
-      <w:r>
-        <w:t xml:space="preserve"> </w:t>
-      </w:r>
-      <w:r>
-        <w:t>breast cancer; prognosis; survival analysis; machine learning; pathway analysis; PAM50; ROR; pre-registration; external validation; triple-negative breast cancer</w:t>
-      </w:r>
-    </w:p>
-    <w:p>
-      <w:r/>
+        <w:t xml:space="preserve">Keywords:</w:t>
+      </w:r>
+      <w:r>
+        <w:t xml:space="preserve"> </w:t>
+      </w:r>
+      <w:r>
+        <w:t xml:space="preserve">breast cancer; prognosis; survival analysis; machine learning; pathway analysis; PAM50; ROR; pre-registration; external validation; triple-negative breast cancer</w:t>
+      </w:r>
+    </w:p>
+    <w:p>
+      <w:r>
+        <w:pict>
+          <v:rect style="width:0;height:1.5pt" o:hralign="center" o:hrstd="t" o:hr="t"/>
+        </w:pict>
+      </w:r>
     </w:p>
     <w:bookmarkEnd w:id="9"/>
     <w:bookmarkStart w:id="10" w:name="background"/>
@@ -644,7 +652,7 @@
         <w:pStyle w:val="Heading1"/>
       </w:pPr>
       <w:r>
-        <w:t>Background</w:t>
+        <w:t xml:space="preserve">Background</w:t>
       </w:r>
     </w:p>
     <w:p>
@@ -1085,7 +1093,39 @@
         <w:t xml:space="preserve"> </w:t>
       </w:r>
       <w:r>
-        <w:t xml:space="preserve">evaluable after pre-specified filters; one sample with non-positive overall survival time is excluded from C-index analyses but retained in patient-characteristics summary statistics, yielding 1,144 events in the patient-characteristics summary and 1,143 events contributing to C-index calculations), and GSE20685 </w:t>
+        <w:t xml:space="preserve">patient-characteristics evaluable after pre-specified filters; one sample with non-positive overall survival time is excluded from C-index analyses but retained in patient-characteristics summary statistics, yielding</w:t>
+      </w:r>
+      <w:r>
+        <w:t xml:space="preserve"> </w:t>
+      </w:r>
+      <m:oMath>
+        <m:r>
+          <m:t>n</m:t>
+        </m:r>
+        <m:r>
+          <m:rPr>
+            <m:sty m:val="p"/>
+          </m:rPr>
+          <m:t>=</m:t>
+        </m:r>
+        <m:r>
+          <m:t>1</m:t>
+        </m:r>
+        <m:r>
+          <m:rPr>
+            <m:sty m:val="p"/>
+          </m:rPr>
+          <m:t>,</m:t>
+        </m:r>
+        <m:r>
+          <m:t>979</m:t>
+        </m:r>
+      </m:oMath>
+      <w:r>
+        <w:t xml:space="preserve"> </w:t>
+      </w:r>
+      <w:r>
+        <w:t xml:space="preserve">metric-evaluable samples, 1,144 events in the patient-characteristics summary, and 1,143 events contributing to C-index calculations), and GSE20685 </w:t>
       </w:r>
       <w:r>
         <w:t xml:space="preserve">(Kao et al. 2011)</w:t>
@@ -3441,7 +3481,7 @@
         <w:pStyle w:val="FirstParagraph"/>
       </w:pPr>
       <w:r>
-        <w:t xml:space="preserve">Across 100 stratified 80% TCGA subsamples without replacement, stratified on event status, the mean pairwise Spearman rank correlation of permutation importance was</w:t>
+        <w:t xml:space="preserve">Across 100 stratified 80% TCGA subsamples without replacement, stratified on event status, the mean pairwise Spearman rank correlation of permutation importance across 4,950 pairwise rank comparisons was</w:t>
       </w:r>
       <w:r>
         <w:t xml:space="preserve"> </w:t>

</xml_diff>